<commit_message>
docs: cierre de entregables UdeC, capturas reales del sistema y endurecimiento operacional (Hito 6)
</commit_message>
<xml_diff>
--- a/docs/entregables-isoft/Especificacion de Requisitos - MonsterBurguer.docx
+++ b/docs/entregables-isoft/Especificacion de Requisitos - MonsterBurguer.docx
@@ -83,12 +83,8 @@
     <w:p>
       <w:pPr/>
       <w:r>
-        <w:rPr>
-          <w:b/>
-        </w:rPr>
-        <w:t>Estudiante: [COMPLETAR: nombre completo del estudiante] [COMPLETAR: Integrantes adicionales del grupo si aplica]</w:t>
-      </w:r>
-      <w:r/>
+        <w:t>Estudiante: Manuel Francisco Amell Gil</w:t>
+      </w:r>
     </w:p>
     <w:p>
       <w:pPr/>

</xml_diff>